<commit_message>
docs: actualizar Primer Informe — mapa interactivo y corriente/inversión atendidos; dirigido al equipo/colegas del Plan Perú 2050
</commit_message>
<xml_diff>
--- a/entregables/Primer-Informe-Plan-Peru-2050.docx
+++ b/entregables/Primer-Informe-Plan-Peru-2050.docx
@@ -97,7 +97,7 @@
           <w:color w:val="1A2238"/>
           <w:sz w:val="22"/>
         </w:rPr>
-        <w:t>Dirigido a: Ing. Tellys Paucar — FIIS / Colegio de Ingenieros del Perú</w:t>
+        <w:t>Dirigido a: Ing. Tellys Paucar y equipo técnico del Plan Perú 2050 — CNPP / Colegio de Ingenieros del Perú</w:t>
       </w:r>
     </w:p>
     <w:p>
@@ -802,7 +802,20 @@
           <w:color w:val="1A2238"/>
           <w:sz w:val="22"/>
         </w:rPr>
-        <w:t>Módulo con datos reales por departamento, provincia y distrito:</w:t>
+        <w:t>Módulo con un mapa interactivo del Perú y datos reales por departamento, provincia y distrito:</w:t>
+      </w:r>
+    </w:p>
+    <w:p>
+      <w:pPr>
+        <w:pStyle w:val="ListBullet"/>
+        <w:spacing w:after="60"/>
+      </w:pPr>
+      <w:r>
+        <w:rPr>
+          <w:color w:val="1A2238"/>
+          <w:sz w:val="22"/>
+        </w:rPr>
+        <w:t>Mapa interactivo por distrito (1,826 distritos), coloreado por IDH, pobreza o pobreza extrema, con detalle al hacer clic en cada distrito.</w:t>
       </w:r>
     </w:p>
     <w:p>
@@ -829,6 +842,19 @@
           <w:sz w:val="22"/>
         </w:rPr>
         <w:t>Gasto público del MEF (SIAF) por departamento: presupuesto, devengado y ejecución del año en curso.</w:t>
+      </w:r>
+    </w:p>
+    <w:p>
+      <w:pPr>
+        <w:pStyle w:val="ListBullet"/>
+        <w:spacing w:after="60"/>
+      </w:pPr>
+      <w:r>
+        <w:rPr>
+          <w:color w:val="1A2238"/>
+          <w:sz w:val="22"/>
+        </w:rPr>
+        <w:t>Presupuesto por tipo de gasto: corriente vs. inversión/capital, por departamento (MEF, año en curso).</w:t>
       </w:r>
     </w:p>
     <w:p>
@@ -1178,7 +1204,7 @@
                 <w:color w:val="1A2238"/>
                 <w:sz w:val="19"/>
               </w:rPr>
-              <w:t>Mapa territorial interactivo (nacional/depto/prov/distrito)</w:t>
+              <w:t>Mapa territorial interactivo por distrito</w:t>
             </w:r>
           </w:p>
         </w:tc>
@@ -1193,7 +1219,7 @@
                 <w:color w:val="1A2238"/>
                 <w:sz w:val="19"/>
               </w:rPr>
-              <w:t>EN CURSO</w:t>
+              <w:t>ATENDIDO — mapa del Perú con IDH/pobreza y detalle por distrito</w:t>
             </w:r>
           </w:p>
         </w:tc>
@@ -1225,7 +1251,7 @@
                 <w:color w:val="1A2238"/>
                 <w:sz w:val="19"/>
               </w:rPr>
-              <w:t>PENDIENTE — requiere re-extracción del MEF</w:t>
+              <w:t>ATENDIDO — por departamento (MEF, tipo de gasto)</w:t>
             </w:r>
           </w:p>
         </w:tc>
@@ -1419,7 +1445,7 @@
           <w:color w:val="1A2238"/>
           <w:sz w:val="22"/>
         </w:rPr>
-        <w:t>Mapa territorial interactivo con selección de nivel (nacional, departamento, provincia, distrito).</w:t>
+        <w:t>Detallar la articulación a nivel de objetivos de cada política de Estado (tercer nivel del Acuerdo Nacional).</w:t>
       </w:r>
     </w:p>
     <w:p>
@@ -1432,7 +1458,7 @@
           <w:color w:val="1A2238"/>
           <w:sz w:val="22"/>
         </w:rPr>
-        <w:t>Incorporar presupuesto corriente y de inversión por territorio (re-extracción del MEF).</w:t>
+        <w:t>Llevar el presupuesto corriente vs. inversión al nivel provincial y distrital.</w:t>
       </w:r>
     </w:p>
     <w:p>

</xml_diff>

<commit_message>
docs: agregar al Ing. Alejandro Camarena como revisor principal en la portada del Primer Informe
</commit_message>
<xml_diff>
--- a/entregables/Primer-Informe-Plan-Peru-2050.docx
+++ b/entregables/Primer-Informe-Plan-Peru-2050.docx
@@ -84,6 +84,20 @@
           <w:sz w:val="22"/>
         </w:rPr>
         <w:t>Elaborado por: Ing. Carlos Cárdenas Fernández</w:t>
+      </w:r>
+    </w:p>
+    <w:p>
+      <w:pPr>
+        <w:spacing w:after="20" w:before="0"/>
+      </w:pPr>
+      <w:r>
+        <w:rPr>
+          <w:b w:val="0"/>
+          <w:i w:val="0"/>
+          <w:color w:val="1A2238"/>
+          <w:sz w:val="22"/>
+        </w:rPr>
+        <w:t>Revisor principal: Ing. Alejandro Camarena</w:t>
       </w:r>
     </w:p>
     <w:p>

</xml_diff>

<commit_message>
docs: agregar Índice y tabla detallada de Fuentes (institución + año por cada dato) al Primer Informe (Word y PDF)
</commit_message>
<xml_diff>
--- a/entregables/Primer-Informe-Plan-Peru-2050.docx
+++ b/entregables/Primer-Informe-Plan-Peru-2050.docx
@@ -126,6 +126,171 @@
           <w:sz w:val="22"/>
         </w:rPr>
         <w:t>Plataforma en línea: https://planperu2050.pe</w:t>
+      </w:r>
+    </w:p>
+    <w:p>
+      <w:pPr>
+        <w:spacing w:after="80" w:before="280"/>
+      </w:pPr>
+      <w:r>
+        <w:rPr>
+          <w:b/>
+          <w:i w:val="0"/>
+          <w:color w:val="D91023"/>
+          <w:sz w:val="30"/>
+        </w:rPr>
+        <w:t>Índice</w:t>
+      </w:r>
+    </w:p>
+    <w:p>
+      <w:pPr>
+        <w:spacing w:after="120"/>
+        <w:pBdr>
+          <w:bottom w:val="single" w:sz="6" w:space="1" w:color="B8840E"/>
+        </w:pBdr>
+      </w:pPr>
+    </w:p>
+    <w:p>
+      <w:pPr>
+        <w:pStyle w:val="ListBullet"/>
+        <w:spacing w:after="60"/>
+      </w:pPr>
+      <w:r>
+        <w:rPr>
+          <w:color w:val="1A2238"/>
+          <w:sz w:val="22"/>
+        </w:rPr>
+        <w:t>1. Resumen ejecutivo</w:t>
+      </w:r>
+    </w:p>
+    <w:p>
+      <w:pPr>
+        <w:pStyle w:val="ListBullet"/>
+        <w:spacing w:after="60"/>
+      </w:pPr>
+      <w:r>
+        <w:rPr>
+          <w:color w:val="1A2238"/>
+          <w:sz w:val="22"/>
+        </w:rPr>
+        <w:t>2. La plataforma y sus módulos</w:t>
+      </w:r>
+    </w:p>
+    <w:p>
+      <w:pPr>
+        <w:pStyle w:val="ListBullet"/>
+        <w:spacing w:after="60"/>
+      </w:pPr>
+      <w:r>
+        <w:rPr>
+          <w:color w:val="1A2238"/>
+          <w:sz w:val="22"/>
+        </w:rPr>
+        <w:t>3. Articulación estratégica (hacia arriba y hacia abajo)</w:t>
+      </w:r>
+    </w:p>
+    <w:p>
+      <w:pPr>
+        <w:pStyle w:val="ListBullet"/>
+        <w:spacing w:after="60"/>
+      </w:pPr>
+      <w:r>
+        <w:rPr>
+          <w:color w:val="1A2238"/>
+          <w:sz w:val="22"/>
+        </w:rPr>
+        <w:t>4. Articulación con el plan de gobierno entrante</w:t>
+      </w:r>
+    </w:p>
+    <w:p>
+      <w:pPr>
+        <w:pStyle w:val="ListBullet"/>
+        <w:spacing w:after="60"/>
+      </w:pPr>
+      <w:r>
+        <w:rPr>
+          <w:color w:val="1A2238"/>
+          <w:sz w:val="22"/>
+        </w:rPr>
+        <w:t>5. Inteligencia territorial</w:t>
+      </w:r>
+    </w:p>
+    <w:p>
+      <w:pPr>
+        <w:pStyle w:val="ListBullet"/>
+        <w:spacing w:after="60"/>
+      </w:pPr>
+      <w:r>
+        <w:rPr>
+          <w:color w:val="1A2238"/>
+          <w:sz w:val="22"/>
+        </w:rPr>
+        <w:t>6. Seguimiento mensual de indicadores</w:t>
+      </w:r>
+    </w:p>
+    <w:p>
+      <w:pPr>
+        <w:pStyle w:val="ListBullet"/>
+        <w:spacing w:after="60"/>
+      </w:pPr>
+      <w:r>
+        <w:rPr>
+          <w:color w:val="1A2238"/>
+          <w:sz w:val="22"/>
+        </w:rPr>
+        <w:t>7. Estado de las observaciones de la última reunión</w:t>
+      </w:r>
+    </w:p>
+    <w:p>
+      <w:pPr>
+        <w:pStyle w:val="ListBullet"/>
+        <w:spacing w:after="60"/>
+      </w:pPr>
+      <w:r>
+        <w:rPr>
+          <w:color w:val="1A2238"/>
+          <w:sz w:val="22"/>
+        </w:rPr>
+        <w:t>8. Fuentes de datos y principio anti-sobreafirmación</w:t>
+      </w:r>
+    </w:p>
+    <w:p>
+      <w:pPr>
+        <w:pStyle w:val="ListBullet"/>
+        <w:spacing w:after="60"/>
+      </w:pPr>
+      <w:r>
+        <w:rPr>
+          <w:color w:val="1A2238"/>
+          <w:sz w:val="22"/>
+        </w:rPr>
+        <w:t>9. Cómo revisar y validar</w:t>
+      </w:r>
+    </w:p>
+    <w:p>
+      <w:pPr>
+        <w:pStyle w:val="ListBullet"/>
+        <w:spacing w:after="60"/>
+      </w:pPr>
+      <w:r>
+        <w:rPr>
+          <w:color w:val="1A2238"/>
+          <w:sz w:val="22"/>
+        </w:rPr>
+        <w:t>10. Próximos pasos</w:t>
+      </w:r>
+    </w:p>
+    <w:p>
+      <w:pPr>
+        <w:pStyle w:val="ListBullet"/>
+        <w:spacing w:after="60"/>
+      </w:pPr>
+      <w:r>
+        <w:rPr>
+          <w:color w:val="1A2238"/>
+          <w:sz w:val="22"/>
+        </w:rPr>
+        <w:t>Anexo. Enlaces</w:t>
       </w:r>
     </w:p>
     <w:p>
@@ -1309,7 +1474,360 @@
           <w:color w:val="1A2238"/>
           <w:sz w:val="22"/>
         </w:rPr>
-        <w:t>Todo el contenido está claramente rotulado según su naturaleza, para no presentar como oficial lo que es estimado o inferido:</w:t>
+        <w:t>Cada dato del tablero indica su fuente y su año. Detalle de las fuentes oficiales utilizadas:</w:t>
+      </w:r>
+    </w:p>
+    <w:tbl>
+      <w:tblPr>
+        <w:tblStyle w:val="LightGrid-Accent1"/>
+        <w:tblW w:type="auto" w:w="0"/>
+        <w:jc w:val="center"/>
+        <w:tblLook w:firstColumn="1" w:firstRow="1" w:lastColumn="0" w:lastRow="0" w:noHBand="0" w:noVBand="1" w:val="04A0"/>
+      </w:tblPr>
+      <w:tblGrid>
+        <w:gridCol w:w="4320"/>
+        <w:gridCol w:w="4320"/>
+      </w:tblGrid>
+      <w:tr>
+        <w:tc>
+          <w:tcPr>
+            <w:tcW w:type="dxa" w:w="4819"/>
+            <w:shd w:val="clear" w:fill="1F2A44"/>
+          </w:tcPr>
+          <w:p>
+            <w:r>
+              <w:rPr>
+                <w:b/>
+                <w:color w:val="FFFFFF"/>
+                <w:sz w:val="19"/>
+              </w:rPr>
+              <w:t>Información</w:t>
+            </w:r>
+          </w:p>
+        </w:tc>
+        <w:tc>
+          <w:tcPr>
+            <w:tcW w:type="dxa" w:w="4819"/>
+            <w:shd w:val="clear" w:fill="1F2A44"/>
+          </w:tcPr>
+          <w:p>
+            <w:r>
+              <w:rPr>
+                <w:b/>
+                <w:color w:val="FFFFFF"/>
+                <w:sz w:val="19"/>
+              </w:rPr>
+              <w:t>Fuente · Año</w:t>
+            </w:r>
+          </w:p>
+        </w:tc>
+      </w:tr>
+      <w:tr>
+        <w:tc>
+          <w:tcPr>
+            <w:tcW w:type="dxa" w:w="4819"/>
+          </w:tcPr>
+          <w:p>
+            <w:r/>
+            <w:r>
+              <w:rPr>
+                <w:color w:val="1A2238"/>
+                <w:sz w:val="19"/>
+              </w:rPr>
+              <w:t>Comisiones Temáticas (visión, diagnóstico, objetivos, metas)</w:t>
+            </w:r>
+          </w:p>
+        </w:tc>
+        <w:tc>
+          <w:tcPr>
+            <w:tcW w:type="dxa" w:w="4819"/>
+          </w:tcPr>
+          <w:p>
+            <w:r/>
+            <w:r>
+              <w:rPr>
+                <w:color w:val="1A2238"/>
+                <w:sz w:val="19"/>
+              </w:rPr>
+              <w:t>Redacciones del CNPP — Colegio de Ingenieros del Perú</w:t>
+            </w:r>
+          </w:p>
+        </w:tc>
+      </w:tr>
+      <w:tr>
+        <w:tc>
+          <w:tcPr>
+            <w:tcW w:type="dxa" w:w="4819"/>
+          </w:tcPr>
+          <w:p>
+            <w:r/>
+            <w:r>
+              <w:rPr>
+                <w:color w:val="1A2238"/>
+                <w:sz w:val="19"/>
+              </w:rPr>
+              <w:t>Ejes y Políticas de Estado</w:t>
+            </w:r>
+          </w:p>
+        </w:tc>
+        <w:tc>
+          <w:tcPr>
+            <w:tcW w:type="dxa" w:w="4819"/>
+          </w:tcPr>
+          <w:p>
+            <w:r/>
+            <w:r>
+              <w:rPr>
+                <w:color w:val="1A2238"/>
+                <w:sz w:val="19"/>
+              </w:rPr>
+              <w:t>Acuerdo Nacional — acuerdonacional.pe</w:t>
+            </w:r>
+          </w:p>
+        </w:tc>
+      </w:tr>
+      <w:tr>
+        <w:tc>
+          <w:tcPr>
+            <w:tcW w:type="dxa" w:w="4819"/>
+          </w:tcPr>
+          <w:p>
+            <w:r/>
+            <w:r>
+              <w:rPr>
+                <w:color w:val="1A2238"/>
+                <w:sz w:val="19"/>
+              </w:rPr>
+              <w:t>Programas Presupuestales</w:t>
+            </w:r>
+          </w:p>
+        </w:tc>
+        <w:tc>
+          <w:tcPr>
+            <w:tcW w:type="dxa" w:w="4819"/>
+          </w:tcPr>
+          <w:p>
+            <w:r/>
+            <w:r>
+              <w:rPr>
+                <w:color w:val="1A2238"/>
+                <w:sz w:val="19"/>
+              </w:rPr>
+              <w:t>MEF — Consulta Amigable / SIAF</w:t>
+            </w:r>
+          </w:p>
+        </w:tc>
+      </w:tr>
+      <w:tr>
+        <w:tc>
+          <w:tcPr>
+            <w:tcW w:type="dxa" w:w="4819"/>
+          </w:tcPr>
+          <w:p>
+            <w:r/>
+            <w:r>
+              <w:rPr>
+                <w:color w:val="1A2238"/>
+                <w:sz w:val="19"/>
+              </w:rPr>
+              <w:t>Gasto público y corriente vs. inversión por departamento</w:t>
+            </w:r>
+          </w:p>
+        </w:tc>
+        <w:tc>
+          <w:tcPr>
+            <w:tcW w:type="dxa" w:w="4819"/>
+          </w:tcPr>
+          <w:p>
+            <w:r/>
+            <w:r>
+              <w:rPr>
+                <w:color w:val="1A2238"/>
+                <w:sz w:val="19"/>
+              </w:rPr>
+              <w:t>MEF — Consulta Amigable / SIAF (año en curso)</w:t>
+            </w:r>
+          </w:p>
+        </w:tc>
+      </w:tr>
+      <w:tr>
+        <w:tc>
+          <w:tcPr>
+            <w:tcW w:type="dxa" w:w="4819"/>
+          </w:tcPr>
+          <w:p>
+            <w:r/>
+            <w:r>
+              <w:rPr>
+                <w:color w:val="1A2238"/>
+                <w:sz w:val="19"/>
+              </w:rPr>
+              <w:t>IDH, pobreza, pobreza extrema y población por distrito</w:t>
+            </w:r>
+          </w:p>
+        </w:tc>
+        <w:tc>
+          <w:tcPr>
+            <w:tcW w:type="dxa" w:w="4819"/>
+          </w:tcPr>
+          <w:p>
+            <w:r/>
+            <w:r>
+              <w:rPr>
+                <w:color w:val="1A2238"/>
+                <w:sz w:val="19"/>
+              </w:rPr>
+              <w:t>PNUD e INEI (IDH 2019)</w:t>
+            </w:r>
+          </w:p>
+        </w:tc>
+      </w:tr>
+      <w:tr>
+        <w:tc>
+          <w:tcPr>
+            <w:tcW w:type="dxa" w:w="4819"/>
+          </w:tcPr>
+          <w:p>
+            <w:r/>
+            <w:r>
+              <w:rPr>
+                <w:color w:val="1A2238"/>
+                <w:sz w:val="19"/>
+              </w:rPr>
+              <w:t>Valor Agregado Bruto (VAB) por departamento</w:t>
+            </w:r>
+          </w:p>
+        </w:tc>
+        <w:tc>
+          <w:tcPr>
+            <w:tcW w:type="dxa" w:w="4819"/>
+          </w:tcPr>
+          <w:p>
+            <w:r/>
+            <w:r>
+              <w:rPr>
+                <w:color w:val="1A2238"/>
+                <w:sz w:val="19"/>
+              </w:rPr>
+              <w:t>INEI — PBI por Departamentos 2007–2023 (2023E)</w:t>
+            </w:r>
+          </w:p>
+        </w:tc>
+      </w:tr>
+      <w:tr>
+        <w:tc>
+          <w:tcPr>
+            <w:tcW w:type="dxa" w:w="4819"/>
+          </w:tcPr>
+          <w:p>
+            <w:r/>
+            <w:r>
+              <w:rPr>
+                <w:color w:val="1A2238"/>
+                <w:sz w:val="19"/>
+              </w:rPr>
+              <w:t>Vulnerabilidad económica a la pobreza</w:t>
+            </w:r>
+          </w:p>
+        </w:tc>
+        <w:tc>
+          <w:tcPr>
+            <w:tcW w:type="dxa" w:w="4819"/>
+          </w:tcPr>
+          <w:p>
+            <w:r/>
+            <w:r>
+              <w:rPr>
+                <w:color w:val="1A2238"/>
+                <w:sz w:val="19"/>
+              </w:rPr>
+              <w:t>INEI (nacional 31,4% 2023; departamental por grupos 2019)</w:t>
+            </w:r>
+          </w:p>
+        </w:tc>
+      </w:tr>
+      <w:tr>
+        <w:tc>
+          <w:tcPr>
+            <w:tcW w:type="dxa" w:w="4819"/>
+          </w:tcPr>
+          <w:p>
+            <w:r/>
+            <w:r>
+              <w:rPr>
+                <w:color w:val="1A2238"/>
+                <w:sz w:val="19"/>
+              </w:rPr>
+              <w:t>Presión tributaria e informalidad laboral</w:t>
+            </w:r>
+          </w:p>
+        </w:tc>
+        <w:tc>
+          <w:tcPr>
+            <w:tcW w:type="dxa" w:w="4819"/>
+          </w:tcPr>
+          <w:p>
+            <w:r/>
+            <w:r>
+              <w:rPr>
+                <w:color w:val="1A2238"/>
+                <w:sz w:val="19"/>
+              </w:rPr>
+              <w:t>BCRP — BCRPData</w:t>
+            </w:r>
+          </w:p>
+        </w:tc>
+      </w:tr>
+      <w:tr>
+        <w:tc>
+          <w:tcPr>
+            <w:tcW w:type="dxa" w:w="4819"/>
+          </w:tcPr>
+          <w:p>
+            <w:r/>
+            <w:r>
+              <w:rPr>
+                <w:color w:val="1A2238"/>
+                <w:sz w:val="19"/>
+              </w:rPr>
+              <w:t>Geometría del mapa (distritos)</w:t>
+            </w:r>
+          </w:p>
+        </w:tc>
+        <w:tc>
+          <w:tcPr>
+            <w:tcW w:type="dxa" w:w="4819"/>
+          </w:tcPr>
+          <w:p>
+            <w:r/>
+            <w:r>
+              <w:rPr>
+                <w:color w:val="1A2238"/>
+                <w:sz w:val="19"/>
+              </w:rPr>
+              <w:t>GeoJSON de distritos del Perú (INEI/MINAM)</w:t>
+            </w:r>
+          </w:p>
+        </w:tc>
+      </w:tr>
+    </w:tbl>
+    <w:p>
+      <w:pPr>
+        <w:spacing w:after="80"/>
+      </w:pPr>
+    </w:p>
+    <w:p>
+      <w:pPr>
+        <w:spacing w:after="120" w:before="0"/>
+      </w:pPr>
+      <w:r>
+        <w:rPr>
+          <w:b w:val="0"/>
+          <w:i w:val="0"/>
+          <w:color w:val="1A2238"/>
+          <w:sz w:val="22"/>
+        </w:rPr>
+        <w:t>Además, todo el contenido está rotulado según su naturaleza, para no presentar como oficial lo que es estimado o inferido:</w:t>
       </w:r>
     </w:p>
     <w:p>

</xml_diff>

<commit_message>
docs(informe): capturas de pantalla (modo claro) incrustadas por sección + índice + descripciones ampliadas; soporte ?tab= y ?theme= para deep-links/capturas
</commit_message>
<xml_diff>
--- a/entregables/Primer-Informe-Plan-Peru-2050.docx
+++ b/entregables/Primer-Informe-Plan-Peru-2050.docx
@@ -750,6 +750,59 @@
     </w:p>
     <w:p>
       <w:pPr>
+        <w:jc w:val="center"/>
+      </w:pPr>
+      <w:r>
+        <w:drawing>
+          <wp:inline xmlns:a="http://schemas.openxmlformats.org/drawingml/2006/main" xmlns:pic="http://schemas.openxmlformats.org/drawingml/2006/picture">
+            <wp:extent cx="5940000" cy="4367647"/>
+            <wp:docPr id="1" name="Picture 1"/>
+            <wp:cNvGraphicFramePr>
+              <a:graphicFrameLocks noChangeAspect="1"/>
+            </wp:cNvGraphicFramePr>
+            <a:graphic>
+              <a:graphicData uri="http://schemas.openxmlformats.org/drawingml/2006/picture">
+                <pic:pic>
+                  <pic:nvPicPr>
+                    <pic:cNvPr id="0" name="cap_explorar.png"/>
+                    <pic:cNvPicPr/>
+                  </pic:nvPicPr>
+                  <pic:blipFill>
+                    <a:blip r:embed="rId9"/>
+                    <a:stretch>
+                      <a:fillRect/>
+                    </a:stretch>
+                  </pic:blipFill>
+                  <pic:spPr>
+                    <a:xfrm>
+                      <a:off x="0" y="0"/>
+                      <a:ext cx="5940000" cy="4367647"/>
+                    </a:xfrm>
+                    <a:prstGeom prst="rect"/>
+                  </pic:spPr>
+                </pic:pic>
+              </a:graphicData>
+            </a:graphic>
+          </wp:inline>
+        </w:drawing>
+      </w:r>
+    </w:p>
+    <w:p>
+      <w:pPr>
+        <w:spacing w:after="240"/>
+        <w:jc w:val="center"/>
+      </w:pPr>
+      <w:r>
+        <w:rPr>
+          <w:i/>
+          <w:color w:val="5D6B88"/>
+          <w:sz w:val="18"/>
+        </w:rPr>
+        <w:t>Vista principal (Explorar): las comisiones temáticas, con filtros por eje del Acuerdo Nacional y estado de validación.</w:t>
+      </w:r>
+    </w:p>
+    <w:p>
+      <w:pPr>
         <w:spacing w:after="80" w:before="280"/>
       </w:pPr>
       <w:r>
@@ -910,6 +963,126 @@
           <w:sz w:val="20"/>
         </w:rPr>
         <w:t>La propuesta de articulación fue generada con inteligencia artificial (un análisis por comisión) y se entrega como PROPUESTA A VALIDAR por el equipo técnico. Se adjunta la matriz completa en Excel para su revisión punto por punto.</w:t>
+      </w:r>
+    </w:p>
+    <w:p>
+      <w:pPr>
+        <w:jc w:val="center"/>
+      </w:pPr>
+      <w:r>
+        <w:drawing>
+          <wp:inline xmlns:a="http://schemas.openxmlformats.org/drawingml/2006/main" xmlns:pic="http://schemas.openxmlformats.org/drawingml/2006/picture">
+            <wp:extent cx="5940000" cy="4367647"/>
+            <wp:docPr id="2" name="Picture 2"/>
+            <wp:cNvGraphicFramePr>
+              <a:graphicFrameLocks noChangeAspect="1"/>
+            </wp:cNvGraphicFramePr>
+            <a:graphic>
+              <a:graphicData uri="http://schemas.openxmlformats.org/drawingml/2006/picture">
+                <pic:pic>
+                  <pic:nvPicPr>
+                    <pic:cNvPr id="0" name="cap_articulacion.png"/>
+                    <pic:cNvPicPr/>
+                  </pic:nvPicPr>
+                  <pic:blipFill>
+                    <a:blip r:embed="rId10"/>
+                    <a:stretch>
+                      <a:fillRect/>
+                    </a:stretch>
+                  </pic:blipFill>
+                  <pic:spPr>
+                    <a:xfrm>
+                      <a:off x="0" y="0"/>
+                      <a:ext cx="5940000" cy="4367647"/>
+                    </a:xfrm>
+                    <a:prstGeom prst="rect"/>
+                  </pic:spPr>
+                </pic:pic>
+              </a:graphicData>
+            </a:graphic>
+          </wp:inline>
+        </w:drawing>
+      </w:r>
+    </w:p>
+    <w:p>
+      <w:pPr>
+        <w:spacing w:after="240"/>
+        <w:jc w:val="center"/>
+      </w:pPr>
+      <w:r>
+        <w:rPr>
+          <w:i/>
+          <w:color w:val="5D6B88"/>
+          <w:sz w:val="18"/>
+        </w:rPr>
+        <w:t>Módulo Articulación: por cada eje y política del Acuerdo Nacional se listan las comisiones vinculadas y el tipo de relación.</w:t>
+      </w:r>
+    </w:p>
+    <w:p>
+      <w:pPr>
+        <w:spacing w:after="120" w:before="0"/>
+      </w:pPr>
+      <w:r>
+        <w:rPr>
+          <w:b w:val="0"/>
+          <w:i w:val="0"/>
+          <w:color w:val="1A2238"/>
+          <w:sz w:val="22"/>
+        </w:rPr>
+        <w:t>Adicionalmente, el módulo Flujos representa esta articulación como un diagrama de flujos (Sankey) por capas, que permite visualizar cómo las Políticas de Estado se conectan con las comisiones y estas con los Programas Presupuestales. El grosor de cada flujo refleja el número de vínculos.</w:t>
+      </w:r>
+    </w:p>
+    <w:p>
+      <w:pPr>
+        <w:jc w:val="center"/>
+      </w:pPr>
+      <w:r>
+        <w:drawing>
+          <wp:inline xmlns:a="http://schemas.openxmlformats.org/drawingml/2006/main" xmlns:pic="http://schemas.openxmlformats.org/drawingml/2006/picture">
+            <wp:extent cx="5940000" cy="4367647"/>
+            <wp:docPr id="3" name="Picture 3"/>
+            <wp:cNvGraphicFramePr>
+              <a:graphicFrameLocks noChangeAspect="1"/>
+            </wp:cNvGraphicFramePr>
+            <a:graphic>
+              <a:graphicData uri="http://schemas.openxmlformats.org/drawingml/2006/picture">
+                <pic:pic>
+                  <pic:nvPicPr>
+                    <pic:cNvPr id="0" name="cap_flujos.png"/>
+                    <pic:cNvPicPr/>
+                  </pic:nvPicPr>
+                  <pic:blipFill>
+                    <a:blip r:embed="rId11"/>
+                    <a:stretch>
+                      <a:fillRect/>
+                    </a:stretch>
+                  </pic:blipFill>
+                  <pic:spPr>
+                    <a:xfrm>
+                      <a:off x="0" y="0"/>
+                      <a:ext cx="5940000" cy="4367647"/>
+                    </a:xfrm>
+                    <a:prstGeom prst="rect"/>
+                  </pic:spPr>
+                </pic:pic>
+              </a:graphicData>
+            </a:graphic>
+          </wp:inline>
+        </w:drawing>
+      </w:r>
+    </w:p>
+    <w:p>
+      <w:pPr>
+        <w:spacing w:after="240"/>
+        <w:jc w:val="center"/>
+      </w:pPr>
+      <w:r>
+        <w:rPr>
+          <w:i/>
+          <w:color w:val="5D6B88"/>
+          <w:sz w:val="18"/>
+        </w:rPr>
+        <w:t>Módulo Flujos: diagrama Sankey por capas — Políticas de Estado → Comisiones del CIP → Programas Presupuestales.</w:t>
       </w:r>
     </w:p>
     <w:p>
@@ -1078,6 +1251,59 @@
     </w:p>
     <w:p>
       <w:pPr>
+        <w:jc w:val="center"/>
+      </w:pPr>
+      <w:r>
+        <w:drawing>
+          <wp:inline xmlns:a="http://schemas.openxmlformats.org/drawingml/2006/main" xmlns:pic="http://schemas.openxmlformats.org/drawingml/2006/picture">
+            <wp:extent cx="5940000" cy="4367647"/>
+            <wp:docPr id="4" name="Picture 4"/>
+            <wp:cNvGraphicFramePr>
+              <a:graphicFrameLocks noChangeAspect="1"/>
+            </wp:cNvGraphicFramePr>
+            <a:graphic>
+              <a:graphicData uri="http://schemas.openxmlformats.org/drawingml/2006/picture">
+                <pic:pic>
+                  <pic:nvPicPr>
+                    <pic:cNvPr id="0" name="cap_territorial.png"/>
+                    <pic:cNvPicPr/>
+                  </pic:nvPicPr>
+                  <pic:blipFill>
+                    <a:blip r:embed="rId12"/>
+                    <a:stretch>
+                      <a:fillRect/>
+                    </a:stretch>
+                  </pic:blipFill>
+                  <pic:spPr>
+                    <a:xfrm>
+                      <a:off x="0" y="0"/>
+                      <a:ext cx="5940000" cy="4367647"/>
+                    </a:xfrm>
+                    <a:prstGeom prst="rect"/>
+                  </pic:spPr>
+                </pic:pic>
+              </a:graphicData>
+            </a:graphic>
+          </wp:inline>
+        </w:drawing>
+      </w:r>
+    </w:p>
+    <w:p>
+      <w:pPr>
+        <w:spacing w:after="240"/>
+        <w:jc w:val="center"/>
+      </w:pPr>
+      <w:r>
+        <w:rPr>
+          <w:i/>
+          <w:color w:val="5D6B88"/>
+          <w:sz w:val="18"/>
+        </w:rPr>
+        <w:t>Módulo Territorial: mapa interactivo del Perú coloreado por IDH a nivel distrital, con el detalle presupuestal y socioeconómico por departamento.</w:t>
+      </w:r>
+    </w:p>
+    <w:p>
+      <w:pPr>
         <w:spacing w:after="80" w:before="280"/>
       </w:pPr>
       <w:r>
@@ -1110,6 +1336,59 @@
           <w:sz w:val="22"/>
         </w:rPr>
         <w:t>Sistema que registra automáticamente, cada mes, qué tan cerca o lejos estamos de las metas aspiracionales 2050. Ordena los indicadores del más lejano al más cercano a su meta y calcula un índice de avance. Para los indicadores que cuentan con una serie estadística oficial, el valor se actualiza solo desde la fuente (hoy 6 indicadores toman su valor del BCRP, con su año y su advertencia de vigencia); el resto usa el valor de la redacción de la comisión. Al agregar las comisiones nuevos indicadores, se incorporan automáticamente.</w:t>
+      </w:r>
+    </w:p>
+    <w:p>
+      <w:pPr>
+        <w:jc w:val="center"/>
+      </w:pPr>
+      <w:r>
+        <w:drawing>
+          <wp:inline xmlns:a="http://schemas.openxmlformats.org/drawingml/2006/main" xmlns:pic="http://schemas.openxmlformats.org/drawingml/2006/picture">
+            <wp:extent cx="5940000" cy="4367647"/>
+            <wp:docPr id="5" name="Picture 5"/>
+            <wp:cNvGraphicFramePr>
+              <a:graphicFrameLocks noChangeAspect="1"/>
+            </wp:cNvGraphicFramePr>
+            <a:graphic>
+              <a:graphicData uri="http://schemas.openxmlformats.org/drawingml/2006/picture">
+                <pic:pic>
+                  <pic:nvPicPr>
+                    <pic:cNvPr id="0" name="cap_seguimiento.png"/>
+                    <pic:cNvPicPr/>
+                  </pic:nvPicPr>
+                  <pic:blipFill>
+                    <a:blip r:embed="rId13"/>
+                    <a:stretch>
+                      <a:fillRect/>
+                    </a:stretch>
+                  </pic:blipFill>
+                  <pic:spPr>
+                    <a:xfrm>
+                      <a:off x="0" y="0"/>
+                      <a:ext cx="5940000" cy="4367647"/>
+                    </a:xfrm>
+                    <a:prstGeom prst="rect"/>
+                  </pic:spPr>
+                </pic:pic>
+              </a:graphicData>
+            </a:graphic>
+          </wp:inline>
+        </w:drawing>
+      </w:r>
+    </w:p>
+    <w:p>
+      <w:pPr>
+        <w:spacing w:after="240"/>
+        <w:jc w:val="center"/>
+      </w:pPr>
+      <w:r>
+        <w:rPr>
+          <w:i/>
+          <w:color w:val="5D6B88"/>
+          <w:sz w:val="18"/>
+        </w:rPr>
+        <w:t>Módulo Seguimiento: los indicadores ordenados del más lejano al más cercano a su meta 2050, con el valor actual, la meta y el porcentaje de avance.</w:t>
       </w:r>
     </w:p>
     <w:p>

</xml_diff>

<commit_message>
docs+xlsx: objetivos AN (551) en el Excel de validación (hoja Objetivos AN) + informe actualizado con nivel-3 y mapa por departamento
</commit_message>
<xml_diff>
--- a/entregables/Primer-Informe-Plan-Peru-2050.docx
+++ b/entregables/Primer-Informe-Plan-Peru-2050.docx
@@ -948,7 +948,34 @@
           <w:color w:val="1A2238"/>
           <w:sz w:val="22"/>
         </w:rPr>
+        <w:t>551 enlaces Comisiones ↔ Objetivos específicos del Acuerdo Nacional (tercer nivel de la jerarquía).</w:t>
+      </w:r>
+    </w:p>
+    <w:p>
+      <w:pPr>
+        <w:pStyle w:val="ListBullet"/>
+        <w:spacing w:after="60"/>
+      </w:pPr>
+      <w:r>
+        <w:rPr>
+          <w:color w:val="1A2238"/>
+          <w:sz w:val="22"/>
+        </w:rPr>
         <w:t>160 enlaces Comisiones ↔ Programas Presupuestales del MEF (hacia abajo, 91 PP).</w:t>
+      </w:r>
+    </w:p>
+    <w:p>
+      <w:pPr>
+        <w:spacing w:after="120" w:before="0"/>
+      </w:pPr>
+      <w:r>
+        <w:rPr>
+          <w:b w:val="0"/>
+          <w:i w:val="0"/>
+          <w:color w:val="1A2238"/>
+          <w:sz w:val="22"/>
+        </w:rPr>
+        <w:t>La jerarquía del Acuerdo Nacional se incorporó en sus tres niveles: 4 ejes, 36 Políticas de Estado y 310 objetivos (los compromisos con letra a, b, c…, tomados de acuerdonacional.pe). La articulación de cada comisión llega ahora hasta el objetivo específico, el nivel más fino y el ideal para el análisis.</w:t>
       </w:r>
     </w:p>
     <w:p>
@@ -1167,7 +1194,7 @@
           <w:color w:val="1A2238"/>
           <w:sz w:val="22"/>
         </w:rPr>
-        <w:t>Mapa interactivo por distrito (1,826 distritos), coloreado por IDH, pobreza o pobreza extrema, con detalle al hacer clic en cada distrito.</w:t>
+        <w:t>Mapa interactivo por distrito (1,826 distritos), coloreado por IDH, pobreza o pobreza extrema; y por departamento según VAB per cápita, vulnerabilidad, ejecución del gasto o porcentaje de inversión. Detalle al hacer clic en cada distrito.</w:t>
       </w:r>
     </w:p>
     <w:p>

</xml_diff>